<commit_message>
feat: Introduce cancellation advisor feature with refund calculations and advice
- Added a new cancellation advisor service that provides refund calculations and advice on whether to cancel or hold a ticket based on booking status.
- Implemented a cancellation advisor API route to fetch cancellation advice for users, integrating with existing waitlist prediction services.
- Developed a refund calculator to determine refund amounts based on cancellation policies and timing.
- Created DTOs for structured responses, including detailed refund summaries and cancellation signals.
- Enhanced the admin control service to manage the new cancellation advisor feature, ensuring proper toggling and state management.

This update significantly enhances the application's booking management capabilities by providing users with informed cancellation advice and transparent refund calculations.
</commit_message>
<xml_diff>
--- a/docs/Phase-2 BE.docx
+++ b/docs/Phase-2 BE.docx
@@ -1806,15 +1806,7 @@
           </w:tcPr>
           <w:p>
             <w:r>
-              <w:rPr>
-                <w:rFonts w:ascii="Arial" w:cs="Arial" w:eastAsia="Arial" w:hAnsi="Arial"/>
-                <w:b/>
-                <w:bCs/>
-                <w:color w:val="B45309"/>
-                <w:sz w:val="19"/>
-                <w:szCs w:val="19"/>
-              </w:rPr>
-              <w:t xml:space="preserve">Pending</w:t>
+              <w:t>Done</w:t>
             </w:r>
           </w:p>
         </w:tc>
@@ -1869,15 +1861,17 @@
           </w:tcPr>
           <w:p>
             <w:r>
-              <w:rPr>
-                <w:rFonts w:ascii="Arial" w:cs="Arial" w:eastAsia="Arial" w:hAnsi="Arial"/>
-                <w:i/>
-                <w:iCs/>
-                <w:color w:val="9AA3AD"/>
-                <w:sz w:val="19"/>
-                <w:szCs w:val="19"/>
-              </w:rPr>
-              <w:t xml:space="preserve">— to be filled —</w:t>
+              <w:t>3-layer hybrid (mirrors Fare Advisor): L1 rules -&gt; L2 XGBoost -&gt; L3 Gemini. One endpoint GET /api/v1/ai/waitlist/prediction/{pnr} -&gt; confirmation_probability + bucket (HIGH/MEDIUM/LOW) + action + reason + signals.</w:t>
+            </w:r>
+          </w:p>
+          <w:p>
+            <w:r>
+              <w:t>L1 rules: clearable-depth vs WL position, WL-type multiplier (GNWL/TQWL/RLWL/PQWL), route cancel-rate. L2 XGBoost trained on ~30k seeded WL journeys, gate PASS (precision 0.95 / recall 0.94). L3 Gemini reason on ?explain (best-effort, templated fallback). LOW bucket -&gt; alternative-train suggestions (reuses Phase-1 search).</w:t>
+            </w:r>
+          </w:p>
+          <w:p>
+            <w:r>
+              <w:t>Ownership-checked (user's own PNR); every risky step degrades to a safe pessimistic default, so the endpoint never blocks.</w:t>
             </w:r>
           </w:p>
         </w:tc>
@@ -1993,15 +1987,7 @@
           </w:tcPr>
           <w:p>
             <w:r>
-              <w:rPr>
-                <w:rFonts w:ascii="Arial" w:cs="Arial" w:eastAsia="Arial" w:hAnsi="Arial"/>
-                <w:b/>
-                <w:bCs/>
-                <w:color w:val="B45309"/>
-                <w:sz w:val="19"/>
-                <w:szCs w:val="19"/>
-              </w:rPr>
-              <w:t xml:space="preserve">Pending</w:t>
+              <w:t>Done</w:t>
             </w:r>
           </w:p>
         </w:tc>
@@ -2056,15 +2042,7 @@
           </w:tcPr>
           <w:p>
             <w:r>
-              <w:rPr>
-                <w:rFonts w:ascii="Arial" w:cs="Arial" w:eastAsia="Arial" w:hAnsi="Arial"/>
-                <w:i/>
-                <w:iCs/>
-                <w:color w:val="9AA3AD"/>
-                <w:sz w:val="19"/>
-                <w:szCs w:val="19"/>
-              </w:rPr>
-              <w:t xml:space="preserve">— to be filled —</w:t>
+              <w:t>Agent retries failed bookings with timing awareness. POST /api/v1/bookings/{booking_id}/retry queues a retry (booking_retry_requests table); GET /{booking_id}/retry-status polls it. Celery task task_auto_retry_booking decides an action per attempt (retry_immediate vs retry_scheduled with a countdown) and re-attempts the booking. Best-effort: failures are logged and the original booking is left untouched.</w:t>
             </w:r>
           </w:p>
         </w:tc>
@@ -2554,15 +2532,7 @@
           </w:tcPr>
           <w:p>
             <w:r>
-              <w:rPr>
-                <w:rFonts w:ascii="Arial" w:cs="Arial" w:eastAsia="Arial" w:hAnsi="Arial"/>
-                <w:b/>
-                <w:bCs/>
-                <w:color w:val="B45309"/>
-                <w:sz w:val="19"/>
-                <w:szCs w:val="19"/>
-              </w:rPr>
-              <w:t xml:space="preserve">Pending</w:t>
+              <w:t>Done</w:t>
             </w:r>
           </w:p>
         </w:tc>
@@ -2617,15 +2587,37 @@
           </w:tcPr>
           <w:p>
             <w:r>
-              <w:rPr>
-                <w:rFonts w:ascii="Arial" w:cs="Arial" w:eastAsia="Arial" w:hAnsi="Arial"/>
-                <w:i/>
-                <w:iCs/>
-                <w:color w:val="9AA3AD"/>
-                <w:sz w:val="19"/>
-                <w:szCs w:val="19"/>
-              </w:rPr>
-              <w:t xml:space="preserve">— to be filled —</w:t>
+              <w:t>Composition feature — genuinely new ML is ~zero (by design). One endpoint GET /api/v1/ai/cancellation/advisor/{pnr}?explain= glues three pieces: a new deterministic RefundCalculator, #03's waitlist prediction (reused as-is), and the #02/#03 advisory pattern (recommendation + action + reason + signals + L3 LLM line). Ownership-checked, rate-limited 10/min, always 200 for an owned PNR.</w:t>
+            </w:r>
+          </w:p>
+          <w:p>
+            <w:r>
+              <w:t>Two halves kept deliberately separate (the #02 lesson re-applied). Refund amount is CALCULATED, never predicted: app/core/refund_calculator.py (mirrors FareCalculator; also covers the Phase-1 'refund engine' backlog item). IRCTC 2015 slabs: CNF flat charge (&gt;48h, per class Rs 240/200/180/120/60) -&gt; 25% (48-12h, min flat) -&gt; 50% (12-4h, min flat) -&gt; zero (&lt;4h / chart prepared); RAC/WL flat Rs 60 clerkage till 30 min before departure; confirmed Tatkal/PT non-refundable. Per-passenger computation on BookingPassengers.fare; the per-booking IRCTC service charge stays non-refundable.</w:t>
+            </w:r>
+          </w:p>
+          <w:p>
+            <w:r>
+              <w:t>WL branch = #03 wrapper. WaitlistPredictionService.predict() reused wholesale (model/rules routing, alternatives on LOW — all free). Bucket -&gt; recommendation: HIGH -&gt; HOLD, MEDIUM -&gt; MONITOR, LOW -&gt; CANCEL_NOW. Money barely matters here (clerkage is flat until 30 min before), so the advice is driven by P(confirm). Safety: a degraded/absent probability NEVER yields CANCEL_NOW — falls to MONITOR, so a prediction failure can't push a user into cancelling.</w:t>
+            </w:r>
+          </w:p>
+          <w:p>
+            <w:r>
+              <w:t>CNF branch = timing advisor, not a cancel/hold verdict (we don't know the user's plans). Builds a refund LADDER — each remaining deduction window with its cancel-by deadline and shrinking refund — and recommends CANCEL_EARLY with the exact drop ('before 25 Jul 15:35 -&gt; Rs 2624; after -&gt; Rs 2103'). Deadline = end of the LAST window still paying the current amount (adjacent windows can pay the same when the 25% slab floors at the flat charge). Refund already zero (Tatkal / &lt;4h) -&gt; HOLD ('nothing to gain by cancelling'). RAC -&gt; HOLD (travel assured, flat clerkage, nothing to time).</w:t>
+            </w:r>
+          </w:p>
+          <w:p>
+            <w:r>
+              <w:t>Same guardrails as the advisor family. Advisor toggle key 'cancellation' — OFF still returns the refund math (deterministic, always safe) and withholds only the advice; FORCE_RULES cascades into the embedded WL prediction. L3 reason on ?explain via Replicate (strict use-only-given-numbers guard; CANCEL_EARLY directive explicitly forbids telling the user to cancel); any LLM failure falls back to the templated reason. Telemetry: only the WL branch logs to ai_prediction_logs (a CNF ladder is arithmetic, not a prediction — keeps AI-health hit/miss clean). Admin AI Control card added; model availability mirrors the waitlist probe.</w:t>
+            </w:r>
+          </w:p>
+          <w:p>
+            <w:r>
+              <w:t>Verified live on the local DB across all branches (WL HIGH via MODEL, CNF ladder near+far, RAC, already-cancelled, departed, unpaid, advisor OFF, ownership 404). Two fixes en route: (1) #03's model path skipped the MIN/MAX_PROB clamp and showed a flat '100% chance' — clamped to 0.02-0.95 at the source; (2) seeded CONFIRMED bookings have no BookingPassengers rows — refund degrades to one pseudo-passenger carrying total_fare so the advisor still works on legacy data.</w:t>
+            </w:r>
+          </w:p>
+          <w:p>
+            <w:r>
+              <w:t>Shipped alongside (found testing the flow): /bookings/ list search. FE's search box only filtered the current page and the backend had no search param — added ?search= (PNR / train number / train name, ILIKE, composes with the UPCOMING/COMPLETED/CANCELLED filter, pagination meta shrinks correctly). Pending follow-ups: wire RefundCalculator into the real cancel/chart-prep refund rows (Refunds insert is still mock), integration test, FE screen (docs/cancellation-advisor-frontend.md is ready).</w:t>
             </w:r>
           </w:p>
         </w:tc>
@@ -2928,15 +2920,7 @@
           </w:tcPr>
           <w:p>
             <w:r>
-              <w:rPr>
-                <w:rFonts w:ascii="Arial" w:cs="Arial" w:eastAsia="Arial" w:hAnsi="Arial"/>
-                <w:b/>
-                <w:bCs/>
-                <w:color w:val="B45309"/>
-                <w:sz w:val="19"/>
-                <w:szCs w:val="19"/>
-              </w:rPr>
-              <w:t xml:space="preserve">Pending</w:t>
+              <w:t>Done</w:t>
             </w:r>
           </w:p>
         </w:tc>
@@ -2991,15 +2975,7 @@
           </w:tcPr>
           <w:p>
             <w:r>
-              <w:rPr>
-                <w:rFonts w:ascii="Arial" w:cs="Arial" w:eastAsia="Arial" w:hAnsi="Arial"/>
-                <w:i/>
-                <w:iCs/>
-                <w:color w:val="9AA3AD"/>
-                <w:sz w:val="19"/>
-                <w:szCs w:val="19"/>
-              </w:rPr>
-              <w:t xml:space="preserve">— to be filled —</w:t>
+              <w:t>GET /api/v1/ai/nlp/search - free-text query ("Delhi to Mumbai tomorrow AC") is parsed by an LLM into a structured train search (source / destination / date / class / quota), which then reuses the Phase-1 /train/search path. LLM text via Replicate (gpt-5-nano) / Gemini, with a safe fallback when parsing fails.</w:t>
             </w:r>
           </w:p>
         </w:tc>
@@ -4604,6 +4580,118 @@
         </w:tc>
       </w:tr>
     </w:tbl>
+    <w:p>
+      <w:r>
+        <w:rPr>
+          <w:b/>
+          <w:sz w:val="32"/>
+        </w:rPr>
+        <w:t>Admin Panel — AI Control &amp; Config</w:t>
+      </w:r>
+    </w:p>
+    <w:p>
+      <w:r>
+        <w:t>Admin/ops control plane over the Phase-2 AI features + platform config. Built and verified live (rolled-back e2e) on the local DB; migration head b8d0f2c4e6a9. Every action is audited (admin_audit_logs); RBAC = AGENT read / ADMIN act + 2FA. Rollout to VM/prod is pending.</w:t>
+      </w:r>
+    </w:p>
+    <w:p>
+      <w:r>
+        <w:rPr>
+          <w:b/>
+          <w:sz w:val="26"/>
+        </w:rPr>
+        <w:t>Built (verified)</w:t>
+      </w:r>
+    </w:p>
+    <w:p>
+      <w:r>
+        <w:t>•  Auth: password login + TOTP 2FA, /me, logout, and login/logout/failed-attempt audit.</w:t>
+      </w:r>
+    </w:p>
+    <w:p>
+      <w:r>
+        <w:t>•  Operations: Audit / Error / Email / Job logs, Overview metrics, Waitlist &amp; Inventory.</w:t>
+      </w:r>
+    </w:p>
+    <w:p>
+      <w:r>
+        <w:t>•  Master Data: Trains / Routes / Stations CRUD.</w:t>
+      </w:r>
+    </w:p>
+    <w:p>
+      <w:r>
+        <w:t>•  Config: Fare Rules, Holiday Calendar, Rate Limits, Quota Allocation, Notification Templates.</w:t>
+      </w:r>
+    </w:p>
+    <w:p>
+      <w:r>
+        <w:t>•  AI Control: Advisor Toggles, Model Versions, Retrain, Prediction Logs, LLM Usage.</w:t>
+      </w:r>
+    </w:p>
+    <w:p>
+      <w:r>
+        <w:rPr>
+          <w:b/>
+          <w:sz w:val="26"/>
+        </w:rPr>
+        <w:t>Backlog / deferred follow-ups</w:t>
+      </w:r>
+    </w:p>
+    <w:p>
+      <w:r>
+        <w:t>•  AI Health screen - now UNBLOCKED (Prediction Logs + LLM Usage telemetry exist); build the /admin/metrics/ai-health aggregation. [High]</w:t>
+      </w:r>
+    </w:p>
+    <w:p>
+      <w:r>
+        <w:t>•  Safe Seeding screen - not built (needs a mockup + scope).</w:t>
+      </w:r>
+    </w:p>
+    <w:p>
+      <w:r>
+        <w:t>•  Prediction reconciler - fill actual/hit-miss on prediction logs (celery-beat; per-advisor ground truth: WL final status, autofill vs booking, fare sell-out). [High]</w:t>
+      </w:r>
+    </w:p>
+    <w:p>
+      <w:r>
+        <w:t>•  Retrain real training executor - decoupled runner (refactor scripts/phase-2 trainers into candidate-producing callables on a dedicated queue) that fills a candidate via register_result(). [ML-ops]</w:t>
+      </w:r>
+    </w:p>
+    <w:p>
+      <w:r>
+        <w:t>•  Model Versions version-aware serving loader - so activating a different ML artifact serves live (today 1 artifact/advisor; RM-ADMIN-MDL-003 guards). [Phase-3]</w:t>
+      </w:r>
+    </w:p>
+    <w:p>
+      <w:r>
+        <w:t>•  Notification Templates send-path wiring - prefer a live DB template, fallback to the HTML file. otp_verify = clean pilot; booking_confirmed = lossy as plain body (Python passenger table + PDF); NO SMS sender exists; waitlist_update/refund_processed have no senders; {{ key }} (files) vs {{key}} (editor) convention mismatch.</w:t>
+      </w:r>
+    </w:p>
+    <w:p>
+      <w:r>
+        <w:t>•  Quota Allocation -&gt; seat-inventory generator (splits unused today; TATKAL_SEAT_ALLOCATION_PERCENT unused).</w:t>
+      </w:r>
+    </w:p>
+    <w:p>
+      <w:r>
+        <w:t>•  Holiday Calendar demand-tier -&gt; feed into Fare/Waitlist advisor predictions (today display-only).</w:t>
+      </w:r>
+    </w:p>
+    <w:p>
+      <w:r>
+        <w:t>•  Fare Rules - daily celery-beat to auto-activate SCHEDULED versions on their effective date.</w:t>
+      </w:r>
+    </w:p>
+    <w:p>
+      <w:r>
+        <w:t>•  Rate Limits - after a full Redis flush, configs fall back to hardcoded until re-warm (optional startup warm-up / version-stamp). [Low]</w:t>
+      </w:r>
+    </w:p>
+    <w:p>
+      <w:r>
+        <w:t>•  Ops: commit the FE docs (docs/admin-*-frontend.md keep getting wiped on branch switch); roll all admin migrations + seeds to the VM; reserve a static external IP for the VM.</w:t>
+      </w:r>
+    </w:p>
     <w:sectPr>
       <w:headerReference w:type="default" r:id="rId7"/>
       <w:footerReference w:type="default" r:id="rId8"/>

</xml_diff>

<commit_message>
chore: Update Phase-2 BE document
- Modified the Phase-2 BE document to reflect recent changes and updates in the project.
- Ensured that the document aligns with the latest features and functionalities implemented in the application.

This update enhances the documentation, providing clearer guidance and information for ongoing development.
</commit_message>
<xml_diff>
--- a/docs/Phase-2 BE.docx
+++ b/docs/Phase-2 BE.docx
@@ -2158,15 +2158,7 @@
           </w:tcPr>
           <w:p>
             <w:r>
-              <w:rPr>
-                <w:rFonts w:ascii="Arial" w:cs="Arial" w:eastAsia="Arial" w:hAnsi="Arial"/>
-                <w:b/>
-                <w:bCs/>
-                <w:color w:val="B45309"/>
-                <w:sz w:val="19"/>
-                <w:szCs w:val="19"/>
-              </w:rPr>
-              <w:t xml:space="preserve">Pending</w:t>
+              <w:t>Done</w:t>
             </w:r>
           </w:p>
         </w:tc>
@@ -2223,13 +2215,60 @@
             <w:r>
               <w:rPr>
                 <w:rFonts w:ascii="Arial" w:cs="Arial" w:eastAsia="Arial" w:hAnsi="Arial"/>
-                <w:i/>
-                <w:iCs/>
-                <w:color w:val="9AA3AD"/>
-                <w:sz w:val="19"/>
-                <w:szCs w:val="19"/>
-              </w:rPr>
-              <w:t xml:space="preserve">— to be filled —</w:t>
+                <w:sz w:val="19"/>
+                <w:szCs w:val="19"/>
+              </w:rPr>
+              <w:t xml:space="preserve">One new endpoint; everything else reused. POST /api/v1/ai/kyc/extract reads an Aadhaar/PAN photo and returns the fields for the user to confirm. It writes NOTHING to the DB and never sets kyc_status. Saving reuses the existing PATCH /auth/update-profile (already encrypts + stores the number); approval reuses the existing admin APPROVE/REJECT flow. Reason: this is a data-entry accelerator, not a new verification authority — the AI reads the card, a human confirms it, an admin decides.</w:t>
+            </w:r>
+          </w:p>
+          <w:p>
+            <w:r>
+              <w:rPr>
+                <w:rFonts w:ascii="Arial" w:cs="Arial" w:eastAsia="Arial" w:hAnsi="Arial"/>
+                <w:sz w:val="19"/>
+                <w:szCs w:val="19"/>
+              </w:rPr>
+              <w:t xml:space="preserve">Replicate vision, model chosen by measurement. gpt-5-mini (MODEL3), not gpt-5-nano: same card, 6 runs each — nano 4/6 fully correct with 1 malformed-JSON failure, mini 6/6 clean. A silently wrong digit on an ID costs far more than the price gap. run_replicate_model passes image_input through untouched, so zero integration-client change; gpt-5 needs max_completion_tokens (not the client default). One retry on malformed JSON. Fields normalised — spaces/hyphens stripped from the number, PAN/gender uppercased — because a spaced "9876 5432 1098" hashes differently and would silently defeat dedupe. Date rule pinned in the prompt (Indian DD/MM/YYYY; 12/04/1995 is 12 April, never 4 December) after the model flipped it once.</w:t>
+            </w:r>
+          </w:p>
+          <w:p>
+            <w:r>
+              <w:rPr>
+                <w:rFonts w:ascii="Arial" w:cs="Arial" w:eastAsia="Arial" w:hAnsi="Arial"/>
+                <w:sz w:val="19"/>
+                <w:szCs w:val="19"/>
+              </w:rPr>
+              <w:t xml:space="preserve">Private storage, no leakage. KYC images go to a separate PRIVATE Supabase bucket (railmind-kyc), reachable only via short-TTL signed URLs — the existing bucket is public. A Pillow pass downscales + re-encodes to JPEG, which also strips EXIF (a phone photo of an ID card carries GPS). No field value is ever logged. OCR failure surfaces as a real RM-KYC error (not a silent empty success), so the user knows to type the number in — deliberately unlike the advisor family, where a degraded result is safe to hide.</w:t>
+            </w:r>
+          </w:p>
+          <w:p>
+            <w:r>
+              <w:rPr>
+                <w:rFonts w:ascii="Arial" w:cs="Arial" w:eastAsia="Arial" w:hAnsi="Arial"/>
+                <w:sz w:val="19"/>
+                <w:szCs w:val="19"/>
+              </w:rPr>
+              <w:t xml:space="preserve">Fixed a dead dedupe check en route. Registration compared user_kyc.aadhaar_number == encrypt_kyc(input), but Fernet is randomised — the equality never matched, so RM-AUTH-006 ("KYC already linked to another account") never fired. Added deterministic aadhaar_hash/pan_hash (HMAC-SHA256, unique, indexed; migration c9e1a4b7d306, backfilled from the ciphertext) and switched dedupe to the hash columns. The confirm path now runs the same uniqueness guard, else the unique index would turn a duplicate submission into a 500 instead of a clean 409.</w:t>
+            </w:r>
+          </w:p>
+          <w:p>
+            <w:r>
+              <w:rPr>
+                <w:rFonts w:ascii="Arial" w:cs="Arial" w:eastAsia="Arial" w:hAnsi="Arial"/>
+                <w:sz w:val="19"/>
+                <w:szCs w:val="19"/>
+              </w:rPr>
+              <w:t xml:space="preserve">Admin can see the document. Added user_kyc.document_path (the confirmed image path), carried back on confirm via update-profile. Admin user-detail (GET /admin/users/{id}) now returns kyc_document_url — a ~10-min signed URL — so a reviewer eyeballs the card against the masked number before APPROVE/REJECT. Null when no image (typed by hand / legacy row). Known display quirk: type+masked show PAN-first when a user has both documents, while the URL is whichever was last confirmed.</w:t>
+            </w:r>
+          </w:p>
+          <w:p>
+            <w:r>
+              <w:rPr>
+                <w:rFonts w:ascii="Arial" w:cs="Arial" w:eastAsia="Arial" w:hAnsi="Arial"/>
+                <w:sz w:val="19"/>
+                <w:szCs w:val="19"/>
+              </w:rPr>
+              <w:t xml:space="preserve">Verified live on the local DB across all branches: clear Aadhaar/PAN, blurred + non-document -&gt; RM-KYC-005 (no guessed digits), PDF 415, &gt;5MB 413, rate limit 5/min -&gt; 429, bogus Replicate token, bucket-is-actually-private, EXIF stripped, zero log leakage, and the full extract -&gt; confirm -&gt; admin signed-URL round trip. FE docs shipped: docs/kyc-ocr-frontend.md + docs/admin-kyc-review-frontend.md. Pending: apply migration on prod + create the railmind-kyc private bucket on prod Supabase (local done); optional image-retention cleanup job. Out of scope by choice: format validation (Aadhaar Verhoeff / PAN regex) and any auto-verify — the AI must never move kyc_status on its own.</w:t>
             </w:r>
           </w:p>
         </w:tc>

</xml_diff>